<commit_message>
feat(v3.6.0): Phase 3.6 BLE Web — Web Bluetooth API Chrome/Edge
- Sprints 1-4 livrés et déployés sur pentarun.netlify.app (2026-03-27)
- lib/utils/web_bluetooth.dart : JS interop BluetoothDevice, GATT, Characteristic, DataView
- lib/services/ble_service_web.dart : scan popup Chrome, connect GATT, hrStream, reconnect gattserverdisconnected
- lib/services/ble_service.dart : export conditionnel → ble_service_web.dart (web)
- lib/screens/setup_screen.dart : _HrPairingCard Web — bouton CONNECTER POLAR H10, badge WEB—CHROME, auto-connect, _webError
- docs : OPENSPEC v3.6.0 + SPECKIT v1.1 mis à jour (statuts sprints, §6.7, §8, §12)

Sprint 5 (tests terrain Polar H10 Chrome Desktop) à valider.

Co-Authored-By: Claude Sonnet 4.6 <noreply@anthropic.com>
</commit_message>
<xml_diff>
--- a/docs/SPECKIT_GUIDE.docx
+++ b/docs/SPECKIT_GUIDE.docx
@@ -2,7 +2,7 @@
 <file path=word/document.xml><?xml version="1.0" encoding="utf-8"?>
 <w:document xmlns:w="http://schemas.openxmlformats.org/wordprocessingml/2006/main" xmlns:m="http://schemas.openxmlformats.org/officeDocument/2006/math" xmlns:r="http://schemas.openxmlformats.org/officeDocument/2006/relationships" xmlns:o="urn:schemas-microsoft-com:office:office" xmlns:v="urn:schemas-microsoft-com:vml" xmlns:w10="urn:schemas-microsoft-com:office:word" xmlns:a="http://schemas.openxmlformats.org/drawingml/2006/main" xmlns:pic="http://schemas.openxmlformats.org/drawingml/2006/picture" xmlns:wp="http://schemas.openxmlformats.org/drawingml/2006/wordprocessingDrawing">
   <w:body>
-    <w:bookmarkStart w:id="44" w:name="X72e1949410cdd4ff17acc5cdb5bc848b0c1ba00"/>
+    <w:bookmarkStart w:id="48" w:name="X72e1949410cdd4ff17acc5cdb5bc848b0c1ba00"/>
     <w:p>
       <w:pPr>
         <w:pStyle w:val="Heading1"/>
@@ -10637,6 +10637,125 @@
               <w:jc w:val="left"/>
             </w:pPr>
             <w:r>
+              <w:t xml:space="preserve">Web Bluetooth sans HTTPS</w:t>
+            </w:r>
+          </w:p>
+        </w:tc>
+        <w:tc>
+          <w:tcPr/>
+          <w:p>
+            <w:pPr>
+              <w:pStyle w:val="Compact"/>
+              <w:jc w:val="left"/>
+            </w:pPr>
+            <w:r>
+              <w:t xml:space="preserve">getUserMedia() et Web Bluetooth bloqués sur HTTP → Phase 3.6/3.7 nécessitent HTTPS (Netlify OK) → §6.7 §6.8</w:t>
+            </w:r>
+          </w:p>
+        </w:tc>
+      </w:tr>
+      <w:tr>
+        <w:tc>
+          <w:tcPr/>
+          <w:p>
+            <w:pPr>
+              <w:pStyle w:val="Compact"/>
+              <w:jc w:val="left"/>
+            </w:pPr>
+            <w:r>
+              <w:t xml:space="preserve">requestDevice() hors gesture utilisateur</w:t>
+            </w:r>
+          </w:p>
+        </w:tc>
+        <w:tc>
+          <w:tcPr/>
+          <w:p>
+            <w:pPr>
+              <w:pStyle w:val="Compact"/>
+              <w:jc w:val="left"/>
+            </w:pPr>
+            <w:r>
+              <w:t xml:space="preserve">Web Bluetooth exige un gesture (clic) pour ouvrir le popup — appel programmatique silencieusement ignoré → §6.7</w:t>
+            </w:r>
+          </w:p>
+        </w:tc>
+      </w:tr>
+      <w:tr>
+        <w:tc>
+          <w:tcPr/>
+          <w:p>
+            <w:pPr>
+              <w:pStyle w:val="Compact"/>
+              <w:jc w:val="left"/>
+            </w:pPr>
+            <w:r>
+              <w:t xml:space="preserve">JS interop Promise sans .toDart</w:t>
+            </w:r>
+          </w:p>
+        </w:tc>
+        <w:tc>
+          <w:tcPr/>
+          <w:p>
+            <w:pPr>
+              <w:pStyle w:val="Compact"/>
+              <w:jc w:val="left"/>
+            </w:pPr>
+            <w:r>
+              <w:t xml:space="preserve">Les API navigateur retournent des JS Promise — utiliser</w:t>
+            </w:r>
+            <w:r>
+              <w:t xml:space="preserve"> </w:t>
+            </w:r>
+            <w:r>
+              <w:rPr>
+                <w:rStyle w:val="VerbatimChar"/>
+              </w:rPr>
+              <w:t xml:space="preserve">.toDart</w:t>
+            </w:r>
+            <w:r>
+              <w:t xml:space="preserve"> </w:t>
+            </w:r>
+            <w:r>
+              <w:t xml:space="preserve">(dart:js_interop) pour les convertir en Future → §6.7 §6.8</w:t>
+            </w:r>
+          </w:p>
+        </w:tc>
+      </w:tr>
+      <w:tr>
+        <w:tc>
+          <w:tcPr/>
+          <w:p>
+            <w:pPr>
+              <w:pStyle w:val="Compact"/>
+              <w:jc w:val="left"/>
+            </w:pPr>
+            <w:r>
+              <w:t xml:space="preserve">MediaPipe avant chargement WASM</w:t>
+            </w:r>
+          </w:p>
+        </w:tc>
+        <w:tc>
+          <w:tcPr/>
+          <w:p>
+            <w:pPr>
+              <w:pStyle w:val="Compact"/>
+              <w:jc w:val="left"/>
+            </w:pPr>
+            <w:r>
+              <w:t xml:space="preserve">PoseLandmarker.create() est async — appeler detectForVideo() avant le chargement WASM provoque un crash silencieux → §6.8</w:t>
+            </w:r>
+          </w:p>
+        </w:tc>
+      </w:tr>
+      <w:tr>
+        <w:tc>
+          <w:tcPr/>
+          <w:p>
+            <w:pPr>
+              <w:pStyle w:val="Compact"/>
+              <w:jc w:val="left"/>
+            </w:pPr>
+            <w:r>
               <w:rPr>
                 <w:rStyle w:val="VerbatimChar"/>
               </w:rPr>
@@ -10659,6 +10778,1080 @@
             </w:pPr>
             <w:r>
               <w:t xml:space="preserve">Dart interdit les const map avec clés double (équality non primitive) → utiliser if/else chain → cf. HrCalculator</w:t>
+            </w:r>
+          </w:p>
+        </w:tc>
+      </w:tr>
+    </w:tbl>
+    <w:p>
+      <w:r>
+        <w:pict>
+          <v:rect style="width:0;height:1.5pt" o:hralign="center" o:hrstd="t" o:hr="t"/>
+        </w:pict>
+      </w:r>
+    </w:p>
+    <w:p>
+      <w:r>
+        <w:pict>
+          <v:rect style="width:0;height:1.5pt" o:hralign="center" o:hrstd="t" o:hr="t"/>
+        </w:pict>
+      </w:r>
+    </w:p>
+    <w:bookmarkEnd w:id="43"/>
+    <w:bookmarkStart w:id="47" w:name="roadmap-phase-3.6-3.7-parité-webapk"/>
+    <w:p>
+      <w:pPr>
+        <w:pStyle w:val="Heading2"/>
+      </w:pPr>
+      <w:r>
+        <w:t xml:space="preserve">8. Roadmap Phase 3.6 + 3.7 — Parité Web/APK</w:t>
+      </w:r>
+    </w:p>
+    <w:bookmarkStart w:id="44" w:name="Xe43d49898b0ee8f016eba8c004906557de2feb1"/>
+    <w:p>
+      <w:pPr>
+        <w:pStyle w:val="Heading3"/>
+      </w:pPr>
+      <w:r>
+        <w:t xml:space="preserve">Phase 3.6 — BLE Web (Chrome/Edge) ✅ — Livrée le 27 Mars 2026</w:t>
+      </w:r>
+    </w:p>
+    <w:p>
+      <w:pPr>
+        <w:pStyle w:val="BlockText"/>
+      </w:pPr>
+      <w:r>
+        <w:t xml:space="preserve">Rend le cardio BLE (Polar H10) fonctionnel depuis Chrome/Edge sur laptop et smartphone.</w:t>
+      </w:r>
+      <w:r>
+        <w:t xml:space="preserve"> </w:t>
+      </w:r>
+      <w:r>
+        <w:t xml:space="preserve">Déployée sur https://pentarun.netlify.app — Deploy ID : 69c6f8eeba4976cb24f03724</w:t>
+      </w:r>
+    </w:p>
+    <w:tbl>
+      <w:tblPr>
+        <w:tblStyle w:val="Table"/>
+        <w:tblW w:type="pct" w:w="5000"/>
+        <w:tblLook w:firstRow="1" w:lastRow="0" w:firstColumn="0" w:lastColumn="0" w:noHBand="0" w:noVBand="0" w:val="0020"/>
+        <w:jc w:val="start"/>
+      </w:tblPr>
+      <w:tblGrid>
+        <w:gridCol w:w="1980"/>
+        <w:gridCol w:w="1980"/>
+        <w:gridCol w:w="1980"/>
+        <w:gridCol w:w="1980"/>
+      </w:tblGrid>
+      <w:tr>
+        <w:trPr>
+          <w:tblHeader w:val="true"/>
+        </w:trPr>
+        <w:tc>
+          <w:tcPr/>
+          <w:p>
+            <w:pPr>
+              <w:pStyle w:val="Compact"/>
+              <w:jc w:val="left"/>
+            </w:pPr>
+            <w:r>
+              <w:t xml:space="preserve">Sprint</w:t>
+            </w:r>
+          </w:p>
+        </w:tc>
+        <w:tc>
+          <w:tcPr/>
+          <w:p>
+            <w:pPr>
+              <w:pStyle w:val="Compact"/>
+              <w:jc w:val="left"/>
+            </w:pPr>
+            <w:r>
+              <w:t xml:space="preserve">Livrable</w:t>
+            </w:r>
+          </w:p>
+        </w:tc>
+        <w:tc>
+          <w:tcPr/>
+          <w:p>
+            <w:pPr>
+              <w:pStyle w:val="Compact"/>
+              <w:jc w:val="left"/>
+            </w:pPr>
+            <w:r>
+              <w:t xml:space="preserve">Durée</w:t>
+            </w:r>
+          </w:p>
+        </w:tc>
+        <w:tc>
+          <w:tcPr/>
+          <w:p>
+            <w:pPr>
+              <w:pStyle w:val="Compact"/>
+              <w:jc w:val="left"/>
+            </w:pPr>
+            <w:r>
+              <w:t xml:space="preserve">Statut</w:t>
+            </w:r>
+          </w:p>
+        </w:tc>
+      </w:tr>
+      <w:tr>
+        <w:tc>
+          <w:tcPr/>
+          <w:p>
+            <w:pPr>
+              <w:pStyle w:val="Compact"/>
+              <w:jc w:val="left"/>
+            </w:pPr>
+            <w:r>
+              <w:t xml:space="preserve">Sprint 1</w:t>
+            </w:r>
+          </w:p>
+        </w:tc>
+        <w:tc>
+          <w:tcPr/>
+          <w:p>
+            <w:pPr>
+              <w:pStyle w:val="Compact"/>
+              <w:jc w:val="left"/>
+            </w:pPr>
+            <w:r>
+              <w:rPr>
+                <w:rStyle w:val="VerbatimChar"/>
+              </w:rPr>
+              <w:t xml:space="preserve">web_bluetooth.dart</w:t>
+            </w:r>
+            <w:r>
+              <w:t xml:space="preserve"> </w:t>
+            </w:r>
+            <w:r>
+              <w:t xml:space="preserve">— JS interop BluetoothDevice / GATT / DataView</w:t>
+            </w:r>
+          </w:p>
+        </w:tc>
+        <w:tc>
+          <w:tcPr/>
+          <w:p>
+            <w:pPr>
+              <w:pStyle w:val="Compact"/>
+              <w:jc w:val="left"/>
+            </w:pPr>
+            <w:r>
+              <w:t xml:space="preserve">5 j</w:t>
+            </w:r>
+          </w:p>
+        </w:tc>
+        <w:tc>
+          <w:tcPr/>
+          <w:p>
+            <w:pPr>
+              <w:pStyle w:val="Compact"/>
+              <w:jc w:val="left"/>
+            </w:pPr>
+            <w:r>
+              <w:t xml:space="preserve">✅ Livré</w:t>
+            </w:r>
+          </w:p>
+        </w:tc>
+      </w:tr>
+      <w:tr>
+        <w:tc>
+          <w:tcPr/>
+          <w:p>
+            <w:pPr>
+              <w:pStyle w:val="Compact"/>
+              <w:jc w:val="left"/>
+            </w:pPr>
+            <w:r>
+              <w:t xml:space="preserve">Sprint 2</w:t>
+            </w:r>
+          </w:p>
+        </w:tc>
+        <w:tc>
+          <w:tcPr/>
+          <w:p>
+            <w:pPr>
+              <w:pStyle w:val="Compact"/>
+              <w:jc w:val="left"/>
+            </w:pPr>
+            <w:r>
+              <w:rPr>
+                <w:rStyle w:val="VerbatimChar"/>
+              </w:rPr>
+              <w:t xml:space="preserve">ble_service_web.dart</w:t>
+            </w:r>
+            <w:r>
+              <w:t xml:space="preserve"> </w:t>
+            </w:r>
+            <w:r>
+              <w:t xml:space="preserve">— scan, connect, hrStream, disconnect</w:t>
+            </w:r>
+          </w:p>
+        </w:tc>
+        <w:tc>
+          <w:tcPr/>
+          <w:p>
+            <w:pPr>
+              <w:pStyle w:val="Compact"/>
+              <w:jc w:val="left"/>
+            </w:pPr>
+            <w:r>
+              <w:t xml:space="preserve">5 j</w:t>
+            </w:r>
+          </w:p>
+        </w:tc>
+        <w:tc>
+          <w:tcPr/>
+          <w:p>
+            <w:pPr>
+              <w:pStyle w:val="Compact"/>
+              <w:jc w:val="left"/>
+            </w:pPr>
+            <w:r>
+              <w:t xml:space="preserve">✅ Livré</w:t>
+            </w:r>
+          </w:p>
+        </w:tc>
+      </w:tr>
+      <w:tr>
+        <w:tc>
+          <w:tcPr/>
+          <w:p>
+            <w:pPr>
+              <w:pStyle w:val="Compact"/>
+              <w:jc w:val="left"/>
+            </w:pPr>
+            <w:r>
+              <w:t xml:space="preserve">Sprint 3</w:t>
+            </w:r>
+          </w:p>
+        </w:tc>
+        <w:tc>
+          <w:tcPr/>
+          <w:p>
+            <w:pPr>
+              <w:pStyle w:val="Compact"/>
+              <w:jc w:val="left"/>
+            </w:pPr>
+            <w:r>
+              <w:rPr>
+                <w:rStyle w:val="VerbatimChar"/>
+              </w:rPr>
+              <w:t xml:space="preserve">_HrPairingCard</w:t>
+            </w:r>
+            <w:r>
+              <w:t xml:space="preserve"> </w:t>
+            </w:r>
+            <w:r>
+              <w:t xml:space="preserve">Web — bouton CONNECTER, badge WEB—CHROME, auto-connect</w:t>
+            </w:r>
+          </w:p>
+        </w:tc>
+        <w:tc>
+          <w:tcPr/>
+          <w:p>
+            <w:pPr>
+              <w:pStyle w:val="Compact"/>
+              <w:jc w:val="left"/>
+            </w:pPr>
+            <w:r>
+              <w:t xml:space="preserve">3 j</w:t>
+            </w:r>
+          </w:p>
+        </w:tc>
+        <w:tc>
+          <w:tcPr/>
+          <w:p>
+            <w:pPr>
+              <w:pStyle w:val="Compact"/>
+              <w:jc w:val="left"/>
+            </w:pPr>
+            <w:r>
+              <w:t xml:space="preserve">✅ Livré</w:t>
+            </w:r>
+          </w:p>
+        </w:tc>
+      </w:tr>
+      <w:tr>
+        <w:tc>
+          <w:tcPr/>
+          <w:p>
+            <w:pPr>
+              <w:pStyle w:val="Compact"/>
+              <w:jc w:val="left"/>
+            </w:pPr>
+            <w:r>
+              <w:t xml:space="preserve">Sprint 4</w:t>
+            </w:r>
+          </w:p>
+        </w:tc>
+        <w:tc>
+          <w:tcPr/>
+          <w:p>
+            <w:pPr>
+              <w:pStyle w:val="Compact"/>
+              <w:jc w:val="left"/>
+            </w:pPr>
+            <w:r>
+              <w:t xml:space="preserve">Reconnexion</w:t>
+            </w:r>
+            <w:r>
+              <w:t xml:space="preserve"> </w:t>
+            </w:r>
+            <w:r>
+              <w:rPr>
+                <w:rStyle w:val="VerbatimChar"/>
+              </w:rPr>
+              <w:t xml:space="preserve">gattserverdisconnected</w:t>
+            </w:r>
+            <w:r>
+              <w:t xml:space="preserve"> </w:t>
+            </w:r>
+            <w:r>
+              <w:t xml:space="preserve">+ catégorisation erreurs (NotFoundError, SecurityError, NotSupportedError)</w:t>
+            </w:r>
+          </w:p>
+        </w:tc>
+        <w:tc>
+          <w:tcPr/>
+          <w:p>
+            <w:pPr>
+              <w:pStyle w:val="Compact"/>
+              <w:jc w:val="left"/>
+            </w:pPr>
+            <w:r>
+              <w:t xml:space="preserve">3 j</w:t>
+            </w:r>
+          </w:p>
+        </w:tc>
+        <w:tc>
+          <w:tcPr/>
+          <w:p>
+            <w:pPr>
+              <w:pStyle w:val="Compact"/>
+              <w:jc w:val="left"/>
+            </w:pPr>
+            <w:r>
+              <w:t xml:space="preserve">✅ Livré</w:t>
+            </w:r>
+          </w:p>
+        </w:tc>
+      </w:tr>
+      <w:tr>
+        <w:tc>
+          <w:tcPr/>
+          <w:p>
+            <w:pPr>
+              <w:pStyle w:val="Compact"/>
+              <w:jc w:val="left"/>
+            </w:pPr>
+            <w:r>
+              <w:t xml:space="preserve">Sprint 5</w:t>
+            </w:r>
+          </w:p>
+        </w:tc>
+        <w:tc>
+          <w:tcPr/>
+          <w:p>
+            <w:pPr>
+              <w:pStyle w:val="Compact"/>
+              <w:jc w:val="left"/>
+            </w:pPr>
+            <w:r>
+              <w:t xml:space="preserve">Tests terrain — Chrome Desktop + Polar H10, Chrome Android, scénarios reconnexion</w:t>
+            </w:r>
+          </w:p>
+        </w:tc>
+        <w:tc>
+          <w:tcPr/>
+          <w:p>
+            <w:pPr>
+              <w:pStyle w:val="Compact"/>
+              <w:jc w:val="left"/>
+            </w:pPr>
+            <w:r>
+              <w:t xml:space="preserve">4 j</w:t>
+            </w:r>
+          </w:p>
+        </w:tc>
+        <w:tc>
+          <w:tcPr/>
+          <w:p>
+            <w:pPr>
+              <w:pStyle w:val="Compact"/>
+              <w:jc w:val="left"/>
+            </w:pPr>
+            <w:r>
+              <w:t xml:space="preserve">🔧 En cours</w:t>
+            </w:r>
+          </w:p>
+        </w:tc>
+      </w:tr>
+    </w:tbl>
+    <w:p>
+      <w:pPr>
+        <w:pStyle w:val="BodyText"/>
+      </w:pPr>
+      <w:r>
+        <w:rPr>
+          <w:bCs/>
+          <w:b/>
+        </w:rPr>
+        <w:t xml:space="preserve">Contraintes :</w:t>
+      </w:r>
+      <w:r>
+        <w:t xml:space="preserve"> </w:t>
+      </w:r>
+      <w:r>
+        <w:t xml:space="preserve">Chrome/Edge uniquement (Web Bluetooth W3C) · HTTPS requis · Popup pairing obligatoire</w:t>
+      </w:r>
+    </w:p>
+    <w:bookmarkEnd w:id="44"/>
+    <w:bookmarkStart w:id="45" w:name="X36b615901054914efd530010d06c7fdfc2c9830"/>
+    <w:p>
+      <w:pPr>
+        <w:pStyle w:val="Heading3"/>
+      </w:pPr>
+      <w:r>
+        <w:t xml:space="preserve">Phase 3.7 — CV Web (MediaPipe, tous navigateurs) — 23 jours estimés</w:t>
+      </w:r>
+    </w:p>
+    <w:p>
+      <w:pPr>
+        <w:pStyle w:val="BlockText"/>
+      </w:pPr>
+      <w:r>
+        <w:t xml:space="preserve">Rend le comptage de reps par caméra fonctionnel dans tous les navigateurs modernes.</w:t>
+      </w:r>
+    </w:p>
+    <w:tbl>
+      <w:tblPr>
+        <w:tblStyle w:val="Table"/>
+        <w:tblW w:type="pct" w:w="5000"/>
+        <w:tblLook w:firstRow="1" w:lastRow="0" w:firstColumn="0" w:lastColumn="0" w:noHBand="0" w:noVBand="0" w:val="0020"/>
+        <w:jc w:val="start"/>
+      </w:tblPr>
+      <w:tblGrid>
+        <w:gridCol w:w="2640"/>
+        <w:gridCol w:w="2640"/>
+        <w:gridCol w:w="2640"/>
+      </w:tblGrid>
+      <w:tr>
+        <w:trPr>
+          <w:tblHeader w:val="true"/>
+        </w:trPr>
+        <w:tc>
+          <w:tcPr/>
+          <w:p>
+            <w:pPr>
+              <w:pStyle w:val="Compact"/>
+              <w:jc w:val="left"/>
+            </w:pPr>
+            <w:r>
+              <w:t xml:space="preserve">Sprint</w:t>
+            </w:r>
+          </w:p>
+        </w:tc>
+        <w:tc>
+          <w:tcPr/>
+          <w:p>
+            <w:pPr>
+              <w:pStyle w:val="Compact"/>
+              <w:jc w:val="left"/>
+            </w:pPr>
+            <w:r>
+              <w:t xml:space="preserve">Livrable</w:t>
+            </w:r>
+          </w:p>
+        </w:tc>
+        <w:tc>
+          <w:tcPr/>
+          <w:p>
+            <w:pPr>
+              <w:pStyle w:val="Compact"/>
+              <w:jc w:val="left"/>
+            </w:pPr>
+            <w:r>
+              <w:t xml:space="preserve">Durée</w:t>
+            </w:r>
+          </w:p>
+        </w:tc>
+      </w:tr>
+      <w:tr>
+        <w:tc>
+          <w:tcPr/>
+          <w:p>
+            <w:pPr>
+              <w:pStyle w:val="Compact"/>
+              <w:jc w:val="left"/>
+            </w:pPr>
+            <w:r>
+              <w:t xml:space="preserve">Sprint 1</w:t>
+            </w:r>
+          </w:p>
+        </w:tc>
+        <w:tc>
+          <w:tcPr/>
+          <w:p>
+            <w:pPr>
+              <w:pStyle w:val="Compact"/>
+              <w:jc w:val="left"/>
+            </w:pPr>
+            <w:r>
+              <w:rPr>
+                <w:rStyle w:val="VerbatimChar"/>
+              </w:rPr>
+              <w:t xml:space="preserve">mediapipe_web.dart</w:t>
+            </w:r>
+            <w:r>
+              <w:t xml:space="preserve"> </w:t>
+            </w:r>
+            <w:r>
+              <w:t xml:space="preserve">+ chargement WASM dans</w:t>
+            </w:r>
+            <w:r>
+              <w:t xml:space="preserve"> </w:t>
+            </w:r>
+            <w:r>
+              <w:rPr>
+                <w:rStyle w:val="VerbatimChar"/>
+              </w:rPr>
+              <w:t xml:space="preserve">web/index.html</w:t>
+            </w:r>
+          </w:p>
+        </w:tc>
+        <w:tc>
+          <w:tcPr/>
+          <w:p>
+            <w:pPr>
+              <w:pStyle w:val="Compact"/>
+              <w:jc w:val="left"/>
+            </w:pPr>
+            <w:r>
+              <w:t xml:space="preserve">3 j</w:t>
+            </w:r>
+          </w:p>
+        </w:tc>
+      </w:tr>
+      <w:tr>
+        <w:tc>
+          <w:tcPr/>
+          <w:p>
+            <w:pPr>
+              <w:pStyle w:val="Compact"/>
+              <w:jc w:val="left"/>
+            </w:pPr>
+            <w:r>
+              <w:t xml:space="preserve">Sprint 2</w:t>
+            </w:r>
+          </w:p>
+        </w:tc>
+        <w:tc>
+          <w:tcPr/>
+          <w:p>
+            <w:pPr>
+              <w:pStyle w:val="Compact"/>
+              <w:jc w:val="left"/>
+            </w:pPr>
+            <w:r>
+              <w:t xml:space="preserve">Accès caméra</w:t>
+            </w:r>
+            <w:r>
+              <w:t xml:space="preserve"> </w:t>
+            </w:r>
+            <w:r>
+              <w:rPr>
+                <w:rStyle w:val="VerbatimChar"/>
+              </w:rPr>
+              <w:t xml:space="preserve">getUserMedia()</w:t>
+            </w:r>
+            <w:r>
+              <w:t xml:space="preserve"> </w:t>
+            </w:r>
+            <w:r>
+              <w:t xml:space="preserve">+</w:t>
+            </w:r>
+            <w:r>
+              <w:t xml:space="preserve"> </w:t>
+            </w:r>
+            <w:r>
+              <w:rPr>
+                <w:rStyle w:val="VerbatimChar"/>
+              </w:rPr>
+              <w:t xml:space="preserve">HtmlElementView</w:t>
+            </w:r>
+            <w:r>
+              <w:t xml:space="preserve"> </w:t>
+            </w:r>
+            <w:r>
+              <w:t xml:space="preserve">Flutter Web</w:t>
+            </w:r>
+          </w:p>
+        </w:tc>
+        <w:tc>
+          <w:tcPr/>
+          <w:p>
+            <w:pPr>
+              <w:pStyle w:val="Compact"/>
+              <w:jc w:val="left"/>
+            </w:pPr>
+            <w:r>
+              <w:t xml:space="preserve">4 j</w:t>
+            </w:r>
+          </w:p>
+        </w:tc>
+      </w:tr>
+      <w:tr>
+        <w:tc>
+          <w:tcPr/>
+          <w:p>
+            <w:pPr>
+              <w:pStyle w:val="Compact"/>
+              <w:jc w:val="left"/>
+            </w:pPr>
+            <w:r>
+              <w:t xml:space="preserve">Sprint 3</w:t>
+            </w:r>
+          </w:p>
+        </w:tc>
+        <w:tc>
+          <w:tcPr/>
+          <w:p>
+            <w:pPr>
+              <w:pStyle w:val="Compact"/>
+              <w:jc w:val="left"/>
+            </w:pPr>
+            <w:r>
+              <w:t xml:space="preserve">Pipeline</w:t>
+            </w:r>
+            <w:r>
+              <w:t xml:space="preserve"> </w:t>
+            </w:r>
+            <w:r>
+              <w:rPr>
+                <w:rStyle w:val="VerbatimChar"/>
+              </w:rPr>
+              <w:t xml:space="preserve">PoseLandmarker.detectForVideo()</w:t>
+            </w:r>
+            <w:r>
+              <w:t xml:space="preserve"> </w:t>
+            </w:r>
+            <w:r>
+              <w:t xml:space="preserve">+ conversion landmarks</w:t>
+            </w:r>
+          </w:p>
+        </w:tc>
+        <w:tc>
+          <w:tcPr/>
+          <w:p>
+            <w:pPr>
+              <w:pStyle w:val="Compact"/>
+              <w:jc w:val="left"/>
+            </w:pPr>
+            <w:r>
+              <w:t xml:space="preserve">5 j</w:t>
+            </w:r>
+          </w:p>
+        </w:tc>
+      </w:tr>
+      <w:tr>
+        <w:tc>
+          <w:tcPr/>
+          <w:p>
+            <w:pPr>
+              <w:pStyle w:val="Compact"/>
+              <w:jc w:val="left"/>
+            </w:pPr>
+            <w:r>
+              <w:t xml:space="preserve">Sprint 4</w:t>
+            </w:r>
+          </w:p>
+        </w:tc>
+        <w:tc>
+          <w:tcPr/>
+          <w:p>
+            <w:pPr>
+              <w:pStyle w:val="Compact"/>
+              <w:jc w:val="left"/>
+            </w:pPr>
+            <w:r>
+              <w:rPr>
+                <w:rStyle w:val="VerbatimChar"/>
+              </w:rPr>
+              <w:t xml:space="preserve">cv_service_web.dart</w:t>
+            </w:r>
+            <w:r>
+              <w:t xml:space="preserve"> </w:t>
+            </w:r>
+            <w:r>
+              <w:t xml:space="preserve">complet —</w:t>
+            </w:r>
+            <w:r>
+              <w:t xml:space="preserve"> </w:t>
+            </w:r>
+            <w:r>
+              <w:rPr>
+                <w:rStyle w:val="VerbatimChar"/>
+              </w:rPr>
+              <w:t xml:space="preserve">buildPreview()</w:t>
+            </w:r>
+            <w:r>
+              <w:t xml:space="preserve">,</w:t>
+            </w:r>
+            <w:r>
+              <w:t xml:space="preserve"> </w:t>
+            </w:r>
+            <w:r>
+              <w:rPr>
+                <w:rStyle w:val="VerbatimChar"/>
+              </w:rPr>
+              <w:t xml:space="preserve">startCamera()</w:t>
+            </w:r>
+            <w:r>
+              <w:t xml:space="preserve">,</w:t>
+            </w:r>
+            <w:r>
+              <w:t xml:space="preserve"> </w:t>
+            </w:r>
+            <w:r>
+              <w:rPr>
+                <w:rStyle w:val="VerbatimChar"/>
+              </w:rPr>
+              <w:t xml:space="preserve">stopCamera()</w:t>
+            </w:r>
+          </w:p>
+        </w:tc>
+        <w:tc>
+          <w:tcPr/>
+          <w:p>
+            <w:pPr>
+              <w:pStyle w:val="Compact"/>
+              <w:jc w:val="left"/>
+            </w:pPr>
+            <w:r>
+              <w:t xml:space="preserve">4 j</w:t>
+            </w:r>
+          </w:p>
+        </w:tc>
+      </w:tr>
+      <w:tr>
+        <w:tc>
+          <w:tcPr/>
+          <w:p>
+            <w:pPr>
+              <w:pStyle w:val="Compact"/>
+              <w:jc w:val="left"/>
+            </w:pPr>
+            <w:r>
+              <w:t xml:space="preserve">Sprint 5</w:t>
+            </w:r>
+          </w:p>
+        </w:tc>
+        <w:tc>
+          <w:tcPr/>
+          <w:p>
+            <w:pPr>
+              <w:pStyle w:val="Compact"/>
+              <w:jc w:val="left"/>
+            </w:pPr>
+            <w:r>
+              <w:t xml:space="preserve">UI — aperçu webcam SetupScreen Web</w:t>
+            </w:r>
+          </w:p>
+        </w:tc>
+        <w:tc>
+          <w:tcPr/>
+          <w:p>
+            <w:pPr>
+              <w:pStyle w:val="Compact"/>
+              <w:jc w:val="left"/>
+            </w:pPr>
+            <w:r>
+              <w:t xml:space="preserve">2 j</w:t>
+            </w:r>
+          </w:p>
+        </w:tc>
+      </w:tr>
+      <w:tr>
+        <w:tc>
+          <w:tcPr/>
+          <w:p>
+            <w:pPr>
+              <w:pStyle w:val="Compact"/>
+              <w:jc w:val="left"/>
+            </w:pPr>
+            <w:r>
+              <w:t xml:space="preserve">Sprint 6</w:t>
+            </w:r>
+          </w:p>
+        </w:tc>
+        <w:tc>
+          <w:tcPr/>
+          <w:p>
+            <w:pPr>
+              <w:pStyle w:val="Compact"/>
+              <w:jc w:val="left"/>
+            </w:pPr>
+            <w:r>
+              <w:t xml:space="preserve">Tests performance WASM (cible 15–30 fps) + validation RepCounterEngine</w:t>
+            </w:r>
+          </w:p>
+        </w:tc>
+        <w:tc>
+          <w:tcPr/>
+          <w:p>
+            <w:pPr>
+              <w:pStyle w:val="Compact"/>
+              <w:jc w:val="left"/>
+            </w:pPr>
+            <w:r>
+              <w:t xml:space="preserve">5 j</w:t>
+            </w:r>
+          </w:p>
+        </w:tc>
+      </w:tr>
+    </w:tbl>
+    <w:p>
+      <w:pPr>
+        <w:pStyle w:val="BodyText"/>
+      </w:pPr>
+      <w:r>
+        <w:rPr>
+          <w:bCs/>
+          <w:b/>
+        </w:rPr>
+        <w:t xml:space="preserve">Compatible :</w:t>
+      </w:r>
+      <w:r>
+        <w:t xml:space="preserve"> </w:t>
+      </w:r>
+      <w:r>
+        <w:t xml:space="preserve">Chrome ✅ · Edge ✅ · Firefox ✅ · Safari ✅ · HTTPS requis</w:t>
+      </w:r>
+    </w:p>
+    <w:bookmarkEnd w:id="45"/>
+    <w:bookmarkStart w:id="46" w:name="couverture-cible-après-3.6-3.7"/>
+    <w:p>
+      <w:pPr>
+        <w:pStyle w:val="Heading3"/>
+      </w:pPr>
+      <w:r>
+        <w:t xml:space="preserve">Couverture cible après 3.6 + 3.7</w:t>
+      </w:r>
+    </w:p>
+    <w:tbl>
+      <w:tblPr>
+        <w:tblStyle w:val="Table"/>
+        <w:tblW w:type="auto" w:w="0"/>
+        <w:tblLook w:firstRow="1" w:lastRow="0" w:firstColumn="0" w:lastColumn="0" w:noHBand="0" w:noVBand="0" w:val="0020"/>
+        <w:jc w:val="start"/>
+      </w:tblPr>
+      <w:tblGrid>
+        <w:gridCol w:w="1980"/>
+        <w:gridCol w:w="1980"/>
+        <w:gridCol w:w="1980"/>
+        <w:gridCol w:w="1980"/>
+      </w:tblGrid>
+      <w:tr>
+        <w:trPr>
+          <w:tblHeader w:val="true"/>
+        </w:trPr>
+        <w:tc>
+          <w:tcPr/>
+          <w:p>
+            <w:pPr>
+              <w:pStyle w:val="Compact"/>
+              <w:jc w:val="left"/>
+            </w:pPr>
+            <w:r>
+              <w:t xml:space="preserve">Plateforme</w:t>
+            </w:r>
+          </w:p>
+        </w:tc>
+        <w:tc>
+          <w:tcPr/>
+          <w:p>
+            <w:pPr>
+              <w:pStyle w:val="Compact"/>
+              <w:jc w:val="left"/>
+            </w:pPr>
+            <w:r>
+              <w:t xml:space="preserve">BLE Cardio</w:t>
+            </w:r>
+          </w:p>
+        </w:tc>
+        <w:tc>
+          <w:tcPr/>
+          <w:p>
+            <w:pPr>
+              <w:pStyle w:val="Compact"/>
+              <w:jc w:val="left"/>
+            </w:pPr>
+            <w:r>
+              <w:t xml:space="preserve">CV Reps</w:t>
+            </w:r>
+          </w:p>
+        </w:tc>
+        <w:tc>
+          <w:tcPr/>
+          <w:p>
+            <w:pPr>
+              <w:pStyle w:val="Compact"/>
+              <w:jc w:val="left"/>
+            </w:pPr>
+            <w:r>
+              <w:t xml:space="preserve">Score</w:t>
+            </w:r>
+          </w:p>
+        </w:tc>
+      </w:tr>
+      <w:tr>
+        <w:tc>
+          <w:tcPr/>
+          <w:p>
+            <w:pPr>
+              <w:pStyle w:val="Compact"/>
+              <w:jc w:val="left"/>
+            </w:pPr>
+            <w:r>
+              <w:t xml:space="preserve">Chrome / Edge (laptop + Android)</w:t>
+            </w:r>
+          </w:p>
+        </w:tc>
+        <w:tc>
+          <w:tcPr/>
+          <w:p>
+            <w:pPr>
+              <w:pStyle w:val="Compact"/>
+              <w:jc w:val="left"/>
+            </w:pPr>
+            <w:r>
+              <w:t xml:space="preserve">✅</w:t>
+            </w:r>
+          </w:p>
+        </w:tc>
+        <w:tc>
+          <w:tcPr/>
+          <w:p>
+            <w:pPr>
+              <w:pStyle w:val="Compact"/>
+              <w:jc w:val="left"/>
+            </w:pPr>
+            <w:r>
+              <w:t xml:space="preserve">✅</w:t>
+            </w:r>
+          </w:p>
+        </w:tc>
+        <w:tc>
+          <w:tcPr/>
+          <w:p>
+            <w:pPr>
+              <w:pStyle w:val="Compact"/>
+              <w:jc w:val="left"/>
+            </w:pPr>
+            <w:r>
+              <w:t xml:space="preserve">10/10</w:t>
+            </w:r>
+          </w:p>
+        </w:tc>
+      </w:tr>
+      <w:tr>
+        <w:tc>
+          <w:tcPr/>
+          <w:p>
+            <w:pPr>
+              <w:pStyle w:val="Compact"/>
+              <w:jc w:val="left"/>
+            </w:pPr>
+            <w:r>
+              <w:t xml:space="preserve">Firefox / Safari</w:t>
+            </w:r>
+          </w:p>
+        </w:tc>
+        <w:tc>
+          <w:tcPr/>
+          <w:p>
+            <w:pPr>
+              <w:pStyle w:val="Compact"/>
+              <w:jc w:val="left"/>
+            </w:pPr>
+            <w:r>
+              <w:t xml:space="preserve">❌ (W3C)</w:t>
+            </w:r>
+          </w:p>
+        </w:tc>
+        <w:tc>
+          <w:tcPr/>
+          <w:p>
+            <w:pPr>
+              <w:pStyle w:val="Compact"/>
+              <w:jc w:val="left"/>
+            </w:pPr>
+            <w:r>
+              <w:t xml:space="preserve">✅</w:t>
+            </w:r>
+          </w:p>
+        </w:tc>
+        <w:tc>
+          <w:tcPr/>
+          <w:p>
+            <w:pPr>
+              <w:pStyle w:val="Compact"/>
+              <w:jc w:val="left"/>
+            </w:pPr>
+            <w:r>
+              <w:t xml:space="preserve">9/10</w:t>
+            </w:r>
+          </w:p>
+        </w:tc>
+      </w:tr>
+      <w:tr>
+        <w:tc>
+          <w:tcPr/>
+          <w:p>
+            <w:pPr>
+              <w:pStyle w:val="Compact"/>
+              <w:jc w:val="left"/>
+            </w:pPr>
+            <w:r>
+              <w:t xml:space="preserve">Android APK</w:t>
+            </w:r>
+          </w:p>
+        </w:tc>
+        <w:tc>
+          <w:tcPr/>
+          <w:p>
+            <w:pPr>
+              <w:pStyle w:val="Compact"/>
+              <w:jc w:val="left"/>
+            </w:pPr>
+            <w:r>
+              <w:t xml:space="preserve">✅</w:t>
+            </w:r>
+          </w:p>
+        </w:tc>
+        <w:tc>
+          <w:tcPr/>
+          <w:p>
+            <w:pPr>
+              <w:pStyle w:val="Compact"/>
+              <w:jc w:val="left"/>
+            </w:pPr>
+            <w:r>
+              <w:t xml:space="preserve">✅</w:t>
+            </w:r>
+          </w:p>
+        </w:tc>
+        <w:tc>
+          <w:tcPr/>
+          <w:p>
+            <w:pPr>
+              <w:pStyle w:val="Compact"/>
+              <w:jc w:val="left"/>
+            </w:pPr>
+            <w:r>
+              <w:t xml:space="preserve">10/10</w:t>
             </w:r>
           </w:p>
         </w:tc>
@@ -10680,11 +11873,12 @@
           <w:iCs/>
           <w:i/>
         </w:rPr>
-        <w:t xml:space="preserve">SPEC-KIT v1.0 · KAFORGE · Kinetic Axiom — Phase 3.5 livrée · Phase 4 = Coaching Solaris · Phase 5 = Infrastructure Souveraine</w:t>
+        <w:t xml:space="preserve">SPEC-KIT v1.1 · KAFORGE · Kinetic Axiom — Phase 3.5 livrée · Phase 3.6 = BLE Web ✅ livrée 2026-03-27 · Phase 3.7 = CV Web 📋 · Phase 4 = Coaching Solaris · Phase 5 = Infrastructure Souveraine</w:t>
       </w:r>
     </w:p>
-    <w:bookmarkEnd w:id="43"/>
-    <w:bookmarkEnd w:id="44"/>
+    <w:bookmarkEnd w:id="46"/>
+    <w:bookmarkEnd w:id="47"/>
+    <w:bookmarkEnd w:id="48"/>
     <w:sectPr/>
   </w:body>
 </w:document>

</xml_diff>